<commit_message>
feat: finished CV generation functionality
</commit_message>
<xml_diff>
--- a/user_info/CV_placeholder_example.docx
+++ b/user_info/CV_placeholder_example.docx
@@ -988,7 +988,7 @@
             </w14:solidFill>
           </w14:textFill>
         </w:rPr>
-        <w:t>{EDUCATION_TEXT}</w:t>
+        <w:t>{EDUCATION_PLACEHOLDER}</w:t>
       </w:r>
     </w:p>
     <w:p>
@@ -1050,6 +1050,59 @@
     <w:p>
       <w:pPr>
         <w:pStyle w:val="Padrão"/>
+        <w:keepNext w:val="0"/>
+        <w:tabs>
+          <w:tab w:val="left" w:pos="720"/>
+          <w:tab w:val="left" w:pos="1440"/>
+          <w:tab w:val="left" w:pos="2160"/>
+          <w:tab w:val="left" w:pos="2880"/>
+          <w:tab w:val="left" w:pos="3600"/>
+          <w:tab w:val="left" w:pos="4320"/>
+          <w:tab w:val="left" w:pos="5040"/>
+          <w:tab w:val="left" w:pos="5760"/>
+          <w:tab w:val="left" w:pos="6480"/>
+          <w:tab w:val="left" w:pos="7200"/>
+          <w:tab w:val="left" w:pos="7920"/>
+          <w:tab w:val="left" w:pos="8640"/>
+          <w:tab w:val="left" w:pos="9200"/>
+        </w:tabs>
+        <w:suppressAutoHyphens w:val="1"/>
+        <w:bidi w:val="0"/>
+        <w:spacing w:before="0" w:after="0" w:line="240" w:lineRule="auto"/>
+        <w:ind w:left="0" w:right="0" w:firstLine="0"/>
+        <w:jc w:val="left"/>
+        <w:rPr>
+          <w:rtl w:val="0"/>
+        </w:rPr>
+      </w:pPr>
+      <w:r>
+        <w:rPr>
+          <w:rFonts w:ascii="Arial" w:hAnsi="Arial"/>
+          <w:b w:val="0"/>
+          <w:outline w:val="0"/>
+          <w:color w:val="2c3e50"/>
+          <w:sz w:val="20"/>
+          <w:szCs w:val="20"/>
+          <w:u w:color="2c3e50"/>
+          <w:rtl w:val="0"/>
+          <w:lang w:val="pt-PT"/>
+          <w14:textOutline w14:w="12700" w14:cap="flat">
+            <w14:noFill/>
+            <w14:miter w14:lim="400000"/>
+          </w14:textOutline>
+          <w14:textFill>
+            <w14:solidFill>
+              <w14:srgbClr w14:val="2C3E50"/>
+            </w14:solidFill>
+          </w14:textFill>
+        </w:rPr>
+        <w:t>{language_en}, {LEVEL_NATIVE}</w:t>
+      </w:r>
+    </w:p>
+    <w:p>
+      <w:pPr>
+        <w:pStyle w:val="Padrão"/>
+        <w:keepNext w:val="0"/>
         <w:tabs>
           <w:tab w:val="left" w:pos="720"/>
           <w:tab w:val="left" w:pos="1440"/>
@@ -1077,6 +1130,7 @@
       <w:r>
         <w:rPr>
           <w:rFonts w:ascii="Arial" w:hAnsi="Arial"/>
+          <w:b w:val="0"/>
           <w:outline w:val="0"/>
           <w:color w:val="2c3e50"/>
           <w:sz w:val="20"/>
@@ -1094,7 +1148,7 @@
             </w14:solidFill>
           </w14:textFill>
         </w:rPr>
-        <w:t>{LANGUAGES_TEXT}</w:t>
+        <w:t>{language_fr}, B2 - {LEVEL_INTERMEDIATE}</w:t>
       </w:r>
     </w:p>
     <w:sectPr>

</xml_diff>